<commit_message>
Acknowledge the Stack Overflow origin in the paper
</commit_message>
<xml_diff>
--- a/paper/paper.docx
+++ b/paper/paper.docx
@@ -3059,17 +3059,88 @@
     </w:p>
     <w:bookmarkEnd w:id="48"/>
     <w:bookmarkEnd w:id="49"/>
-    <w:bookmarkStart w:id="69" w:name="references"/>
+    <w:bookmarkStart w:id="51" w:name="acknowledgements"/>
     <w:p>
       <w:pPr>
         <w:pStyle w:val="Heading1"/>
       </w:pPr>
       <w:r>
+        <w:t xml:space="preserve">Acknowledgements</w:t>
+      </w:r>
+    </w:p>
+    <w:p>
+      <w:pPr>
+        <w:pStyle w:val="FirstParagraph"/>
+      </w:pPr>
+      <w:r>
+        <w:t xml:space="preserve">This package grew out of the author’s Stack Overflow question</w:t>
+      </w:r>
+      <w:r>
+        <w:t xml:space="preserve"> </w:t>
+      </w:r>
+      <w:hyperlink r:id="rId50">
+        <w:r>
+          <w:rPr>
+            <w:rStyle w:val="Hyperlink"/>
+          </w:rPr>
+          <w:t xml:space="preserve">“</w:t>
+        </w:r>
+        <w:r>
+          <w:rPr>
+            <w:rStyle w:val="Hyperlink"/>
+          </w:rPr>
+          <w:t xml:space="preserve">Make a</w:t>
+        </w:r>
+        <w:r>
+          <w:rPr>
+            <w:rStyle w:val="Hyperlink"/>
+          </w:rPr>
+          <w:t xml:space="preserve"> </w:t>
+        </w:r>
+        <w:r>
+          <w:rPr>
+            <w:rStyle w:val="Hyperlink"/>
+          </w:rPr>
+          <w:t xml:space="preserve">circular Voronoi diagram in</w:t>
+        </w:r>
+        <w:r>
+          <w:rPr>
+            <w:rStyle w:val="Hyperlink"/>
+          </w:rPr>
+          <w:t xml:space="preserve"> </w:t>
+        </w:r>
+        <w:r>
+          <w:rPr>
+            <w:rStyle w:val="Hyperlink"/>
+          </w:rPr>
+          <w:t xml:space="preserve">R</w:t>
+        </w:r>
+        <w:r>
+          <w:rPr>
+            <w:rStyle w:val="Hyperlink"/>
+          </w:rPr>
+          <w:t xml:space="preserve">”</w:t>
+        </w:r>
+      </w:hyperlink>
+      <w:r>
+        <w:t xml:space="preserve"> </w:t>
+      </w:r>
+      <w:r>
+        <w:t xml:space="preserve">and owes much to the inspiration of Allan Cameron’s answer there.</w:t>
+      </w:r>
+    </w:p>
+    <w:bookmarkEnd w:id="51"/>
+    <w:bookmarkStart w:id="71" w:name="references"/>
+    <w:p>
+      <w:pPr>
+        <w:pStyle w:val="Heading1"/>
+      </w:pPr>
+      <w:r>
         <w:t xml:space="preserve">References</w:t>
       </w:r>
     </w:p>
-    <w:bookmarkStart w:id="68" w:name="refs"/>
-    <w:bookmarkStart w:id="51" w:name="ref-aurenhammer1987"/>
+    <w:bookmarkStart w:id="70" w:name="refs"/>
+    <w:bookmarkStart w:id="53" w:name="ref-aurenhammer1987"/>
     <w:p>
       <w:pPr>
         <w:pStyle w:val="Bibliography"/>
@@ -3102,7 +3173,7 @@
       <w:r>
         <w:t xml:space="preserve"> </w:t>
       </w:r>
-      <w:hyperlink r:id="rId50">
+      <w:hyperlink r:id="rId52">
         <w:r>
           <w:rPr>
             <w:rStyle w:val="Hyperlink"/>
@@ -3114,8 +3185,8 @@
         <w:t xml:space="preserve">.</w:t>
       </w:r>
     </w:p>
-    <w:bookmarkEnd w:id="51"/>
-    <w:bookmarkStart w:id="53" w:name="ref-balzer2005"/>
+    <w:bookmarkEnd w:id="53"/>
+    <w:bookmarkStart w:id="55" w:name="ref-balzer2005"/>
     <w:p>
       <w:pPr>
         <w:pStyle w:val="Bibliography"/>
@@ -3151,7 +3222,7 @@
       <w:r>
         <w:t xml:space="preserve"> </w:t>
       </w:r>
-      <w:hyperlink r:id="rId52">
+      <w:hyperlink r:id="rId54">
         <w:r>
           <w:rPr>
             <w:rStyle w:val="Hyperlink"/>
@@ -3163,8 +3234,8 @@
         <w:t xml:space="preserve">.</w:t>
       </w:r>
     </w:p>
-    <w:bookmarkEnd w:id="53"/>
-    <w:bookmarkStart w:id="55" w:name="ref-engler2025"/>
+    <w:bookmarkEnd w:id="55"/>
+    <w:bookmarkStart w:id="57" w:name="ref-engler2025"/>
     <w:p>
       <w:pPr>
         <w:pStyle w:val="Bibliography"/>
@@ -3197,7 +3268,7 @@
       <w:r>
         <w:t xml:space="preserve"> </w:t>
       </w:r>
-      <w:hyperlink r:id="rId54">
+      <w:hyperlink r:id="rId56">
         <w:r>
           <w:rPr>
             <w:rStyle w:val="Hyperlink"/>
@@ -3209,8 +3280,8 @@
         <w:t xml:space="preserve">.</w:t>
       </w:r>
     </w:p>
-    <w:bookmarkEnd w:id="55"/>
-    <w:bookmarkStart w:id="57" w:name="ref-faoaquastat"/>
+    <w:bookmarkEnd w:id="57"/>
+    <w:bookmarkStart w:id="59" w:name="ref-faoaquastat"/>
     <w:p>
       <w:pPr>
         <w:pStyle w:val="Bibliography"/>
@@ -3242,7 +3313,7 @@
       <w:r>
         <w:t xml:space="preserve"> </w:t>
       </w:r>
-      <w:hyperlink r:id="rId56">
+      <w:hyperlink r:id="rId58">
         <w:r>
           <w:rPr>
             <w:rStyle w:val="Hyperlink"/>
@@ -3254,8 +3325,8 @@
         <w:t xml:space="preserve">.</w:t>
       </w:r>
     </w:p>
-    <w:bookmarkEnd w:id="57"/>
-    <w:bookmarkStart w:id="59" w:name="ref-bench"/>
+    <w:bookmarkEnd w:id="59"/>
+    <w:bookmarkStart w:id="61" w:name="ref-bench"/>
     <w:p>
       <w:pPr>
         <w:pStyle w:val="Bibliography"/>
@@ -3272,7 +3343,7 @@
       <w:r>
         <w:t xml:space="preserve"> </w:t>
       </w:r>
-      <w:hyperlink r:id="rId58">
+      <w:hyperlink r:id="rId60">
         <w:r>
           <w:rPr>
             <w:rStyle w:val="Hyperlink"/>
@@ -3284,8 +3355,8 @@
         <w:t xml:space="preserve">.</w:t>
       </w:r>
     </w:p>
-    <w:bookmarkEnd w:id="59"/>
-    <w:bookmarkStart w:id="61" w:name="ref-weightedtreemaps"/>
+    <w:bookmarkEnd w:id="61"/>
+    <w:bookmarkStart w:id="63" w:name="ref-weightedtreemaps"/>
     <w:p>
       <w:pPr>
         <w:pStyle w:val="Bibliography"/>
@@ -3302,7 +3373,7 @@
       <w:r>
         <w:t xml:space="preserve"> </w:t>
       </w:r>
-      <w:hyperlink r:id="rId60">
+      <w:hyperlink r:id="rId62">
         <w:r>
           <w:rPr>
             <w:rStyle w:val="Hyperlink"/>
@@ -3314,8 +3385,8 @@
         <w:t xml:space="preserve">.</w:t>
       </w:r>
     </w:p>
-    <w:bookmarkEnd w:id="61"/>
-    <w:bookmarkStart w:id="63" w:name="ref-voronoitreemap"/>
+    <w:bookmarkEnd w:id="63"/>
+    <w:bookmarkStart w:id="65" w:name="ref-voronoitreemap"/>
     <w:p>
       <w:pPr>
         <w:pStyle w:val="Bibliography"/>
@@ -3332,7 +3403,7 @@
       <w:r>
         <w:t xml:space="preserve"> </w:t>
       </w:r>
-      <w:hyperlink r:id="rId62">
+      <w:hyperlink r:id="rId64">
         <w:r>
           <w:rPr>
             <w:rStyle w:val="Hyperlink"/>
@@ -3344,8 +3415,8 @@
         <w:t xml:space="preserve">.</w:t>
       </w:r>
     </w:p>
-    <w:bookmarkEnd w:id="63"/>
-    <w:bookmarkStart w:id="65" w:name="ref-nocaj2012"/>
+    <w:bookmarkEnd w:id="65"/>
+    <w:bookmarkStart w:id="67" w:name="ref-nocaj2012"/>
     <w:p>
       <w:pPr>
         <w:pStyle w:val="Bibliography"/>
@@ -3387,7 +3458,7 @@
       <w:r>
         <w:t xml:space="preserve"> </w:t>
       </w:r>
-      <w:hyperlink r:id="rId64">
+      <w:hyperlink r:id="rId66">
         <w:r>
           <w:rPr>
             <w:rStyle w:val="Hyperlink"/>
@@ -3399,8 +3470,8 @@
         <w:t xml:space="preserve">.</w:t>
       </w:r>
     </w:p>
-    <w:bookmarkEnd w:id="65"/>
-    <w:bookmarkStart w:id="67" w:name="ref-wickham2016"/>
+    <w:bookmarkEnd w:id="67"/>
+    <w:bookmarkStart w:id="69" w:name="ref-wickham2016"/>
     <w:p>
       <w:pPr>
         <w:pStyle w:val="Bibliography"/>
@@ -3424,7 +3495,7 @@
       <w:r>
         <w:t xml:space="preserve"> </w:t>
       </w:r>
-      <w:hyperlink r:id="rId66">
+      <w:hyperlink r:id="rId68">
         <w:r>
           <w:rPr>
             <w:rStyle w:val="Hyperlink"/>
@@ -3436,9 +3507,9 @@
         <w:t xml:space="preserve">.</w:t>
       </w:r>
     </w:p>
-    <w:bookmarkEnd w:id="67"/>
-    <w:bookmarkEnd w:id="68"/>
     <w:bookmarkEnd w:id="69"/>
+    <w:bookmarkEnd w:id="70"/>
+    <w:bookmarkEnd w:id="71"/>
     <w:sectPr/>
   </w:body>
 </w:document>

</xml_diff>

<commit_message>
Paper quality pass: convergence forensics, explanatory captions, full API figure
- Diagnosed the n=100 accuracy spike: the layout exhausts the default
  200-iteration budget unconverged (median error 27%); the same instance
  converges to 2.3% mean error at 383 iterations with max_iter = 500.
  Benchmarks section now reports accuracy as a convergence story, with the
  converged-flag transparency and WeightedTreemaps' matching behaviour
- Figure 1 panel C now enumerates the complete exported vocabulary (24
  functions grouped by role, tidyplots-style); panel D expanded argument
  lists; pipe glyphs on the chain arrows
- all four figure captions rewritten to fully explain the panels (data,
  encodings, how to read them, takeaways)
- abstract claims sharpened; Methods records exact benchmark defaults;
  Conclusion gains limitations + planned spatial-indexing speedup
</commit_message>
<xml_diff>
--- a/paper/paper.docx
+++ b/paper/paper.docx
@@ -883,55 +883,211 @@
         <w:t xml:space="preserve"> </w:t>
       </w:r>
       <w:r>
-        <w:t xml:space="preserve">achieves</w:t>
-      </w:r>
-      <w:r>
-        <w:t xml:space="preserve"> </w:t>
-      </w:r>
-      <w:r>
-        <w:t xml:space="preserve">comparable</w:t>
-      </w:r>
-      <w:r>
-        <w:t xml:space="preserve"> </w:t>
-      </w:r>
-      <w:r>
-        <w:t xml:space="preserve">layout</w:t>
-      </w:r>
-      <w:r>
-        <w:t xml:space="preserve"> </w:t>
-      </w:r>
-      <w:r>
-        <w:t xml:space="preserve">accuracy</w:t>
-      </w:r>
-      <w:r>
-        <w:t xml:space="preserve"> </w:t>
-      </w:r>
-      <w:r>
-        <w:t xml:space="preserve">with</w:t>
-      </w:r>
-      <w:r>
-        <w:t xml:space="preserve"> </w:t>
-      </w:r>
-      <w:r>
-        <w:t xml:space="preserve">a</w:t>
-      </w:r>
-      <w:r>
-        <w:t xml:space="preserve"> </w:t>
-      </w:r>
-      <w:r>
-        <w:t xml:space="preserve">trivially</w:t>
-      </w:r>
-      <w:r>
-        <w:t xml:space="preserve"> </w:t>
-      </w:r>
-      <w:r>
-        <w:t xml:space="preserve">simple</w:t>
-      </w:r>
-      <w:r>
-        <w:t xml:space="preserve"> </w:t>
-      </w:r>
-      <w:r>
-        <w:t xml:space="preserve">installation,</w:t>
+        <w:t xml:space="preserve">has</w:t>
+      </w:r>
+      <w:r>
+        <w:t xml:space="preserve"> </w:t>
+      </w:r>
+      <w:r>
+        <w:t xml:space="preserve">the</w:t>
+      </w:r>
+      <w:r>
+        <w:t xml:space="preserve"> </w:t>
+      </w:r>
+      <w:r>
+        <w:t xml:space="preserve">simplest</w:t>
+      </w:r>
+      <w:r>
+        <w:t xml:space="preserve"> </w:t>
+      </w:r>
+      <w:r>
+        <w:t xml:space="preserve">installation</w:t>
+      </w:r>
+      <w:r>
+        <w:t xml:space="preserve"> </w:t>
+      </w:r>
+      <w:r>
+        <w:t xml:space="preserve">and</w:t>
+      </w:r>
+      <w:r>
+        <w:t xml:space="preserve"> </w:t>
+      </w:r>
+      <w:r>
+        <w:t xml:space="preserve">the</w:t>
+      </w:r>
+      <w:r>
+        <w:t xml:space="preserve"> </w:t>
+      </w:r>
+      <w:r>
+        <w:t xml:space="preserve">shortest</w:t>
+      </w:r>
+      <w:r>
+        <w:t xml:space="preserve"> </w:t>
+      </w:r>
+      <w:r>
+        <w:t xml:space="preserve">code</w:t>
+      </w:r>
+      <w:r>
+        <w:t xml:space="preserve"> </w:t>
+      </w:r>
+      <w:r>
+        <w:t xml:space="preserve">for</w:t>
+      </w:r>
+      <w:r>
+        <w:t xml:space="preserve"> </w:t>
+      </w:r>
+      <w:r>
+        <w:t xml:space="preserve">the</w:t>
+      </w:r>
+      <w:r>
+        <w:t xml:space="preserve"> </w:t>
+      </w:r>
+      <w:r>
+        <w:t xml:space="preserve">same</w:t>
+      </w:r>
+      <w:r>
+        <w:t xml:space="preserve"> </w:t>
+      </w:r>
+      <w:r>
+        <w:t xml:space="preserve">plot,</w:t>
+      </w:r>
+      <w:r>
+        <w:t xml:space="preserve"> </w:t>
+      </w:r>
+      <w:r>
+        <w:t xml:space="preserve">is</w:t>
+      </w:r>
+      <w:r>
+        <w:t xml:space="preserve"> </w:t>
+      </w:r>
+      <w:r>
+        <w:t xml:space="preserve">the</w:t>
+      </w:r>
+      <w:r>
+        <w:t xml:space="preserve"> </w:t>
+      </w:r>
+      <w:r>
+        <w:t xml:space="preserve">fastest</w:t>
+      </w:r>
+      <w:r>
+        <w:t xml:space="preserve"> </w:t>
+      </w:r>
+      <w:r>
+        <w:t xml:space="preserve">of</w:t>
+      </w:r>
+      <w:r>
+        <w:t xml:space="preserve"> </w:t>
+      </w:r>
+      <w:r>
+        <w:t xml:space="preserve">the</w:t>
+      </w:r>
+      <w:r>
+        <w:t xml:space="preserve"> </w:t>
+      </w:r>
+      <w:r>
+        <w:t xml:space="preserve">measurable</w:t>
+      </w:r>
+      <w:r>
+        <w:t xml:space="preserve"> </w:t>
+      </w:r>
+      <w:r>
+        <w:t xml:space="preserve">implementations</w:t>
+      </w:r>
+      <w:r>
+        <w:t xml:space="preserve"> </w:t>
+      </w:r>
+      <w:r>
+        <w:t xml:space="preserve">below</w:t>
+      </w:r>
+      <w:r>
+        <w:t xml:space="preserve"> </w:t>
+      </w:r>
+      <w:r>
+        <w:t xml:space="preserve">about</w:t>
+      </w:r>
+      <w:r>
+        <w:t xml:space="preserve"> </w:t>
+      </w:r>
+      <w:r>
+        <w:t xml:space="preserve">fifty</w:t>
+      </w:r>
+      <w:r>
+        <w:t xml:space="preserve"> </w:t>
+      </w:r>
+      <w:r>
+        <w:t xml:space="preserve">cells,</w:t>
+      </w:r>
+      <w:r>
+        <w:t xml:space="preserve"> </w:t>
+      </w:r>
+      <w:r>
+        <w:t xml:space="preserve">and</w:t>
+      </w:r>
+      <w:r>
+        <w:t xml:space="preserve"> </w:t>
+      </w:r>
+      <w:r>
+        <w:t xml:space="preserve">trades</w:t>
+      </w:r>
+      <w:r>
+        <w:t xml:space="preserve"> </w:t>
+      </w:r>
+      <w:r>
+        <w:t xml:space="preserve">runtime</w:t>
+      </w:r>
+      <w:r>
+        <w:t xml:space="preserve"> </w:t>
+      </w:r>
+      <w:r>
+        <w:t xml:space="preserve">–</w:t>
+      </w:r>
+      <w:r>
+        <w:t xml:space="preserve"> </w:t>
+      </w:r>
+      <w:r>
+        <w:t xml:space="preserve">governed</w:t>
+      </w:r>
+      <w:r>
+        <w:t xml:space="preserve"> </w:t>
+      </w:r>
+      <w:r>
+        <w:t xml:space="preserve">by</w:t>
+      </w:r>
+      <w:r>
+        <w:t xml:space="preserve"> </w:t>
+      </w:r>
+      <w:r>
+        <w:t xml:space="preserve">an</w:t>
+      </w:r>
+      <w:r>
+        <w:t xml:space="preserve"> </w:t>
+      </w:r>
+      <w:r>
+        <w:t xml:space="preserve">explicit,</w:t>
+      </w:r>
+      <w:r>
+        <w:t xml:space="preserve"> </w:t>
+      </w:r>
+      <w:r>
+        <w:t xml:space="preserve">user-visible</w:t>
+      </w:r>
+      <w:r>
+        <w:t xml:space="preserve"> </w:t>
+      </w:r>
+      <w:r>
+        <w:t xml:space="preserve">iteration</w:t>
+      </w:r>
+      <w:r>
+        <w:t xml:space="preserve"> </w:t>
+      </w:r>
+      <w:r>
+        <w:t xml:space="preserve">budget</w:t>
+      </w:r>
+      <w:r>
+        <w:t xml:space="preserve"> </w:t>
+      </w:r>
+      <w:r>
+        <w:t xml:space="preserve">–</w:t>
       </w:r>
       <w:r>
         <w:t xml:space="preserve"> </w:t>
@@ -943,55 +1099,13 @@
         <w:t xml:space="preserve"> </w:t>
       </w:r>
       <w:r>
-        <w:t xml:space="preserve">the</w:t>
-      </w:r>
-      <w:r>
-        <w:t xml:space="preserve"> </w:t>
-      </w:r>
-      <w:r>
-        <w:t xml:space="preserve">cost</w:t>
-      </w:r>
-      <w:r>
-        <w:t xml:space="preserve"> </w:t>
-      </w:r>
-      <w:r>
-        <w:t xml:space="preserve">of</w:t>
-      </w:r>
-      <w:r>
-        <w:t xml:space="preserve"> </w:t>
-      </w:r>
-      <w:r>
-        <w:t xml:space="preserve">longer</w:t>
-      </w:r>
-      <w:r>
-        <w:t xml:space="preserve"> </w:t>
-      </w:r>
-      <w:r>
-        <w:t xml:space="preserve">runtimes</w:t>
-      </w:r>
-      <w:r>
-        <w:t xml:space="preserve"> </w:t>
-      </w:r>
-      <w:r>
-        <w:t xml:space="preserve">for</w:t>
-      </w:r>
-      <w:r>
-        <w:t xml:space="preserve"> </w:t>
-      </w:r>
-      <w:r>
-        <w:t xml:space="preserve">very</w:t>
-      </w:r>
-      <w:r>
-        <w:t xml:space="preserve"> </w:t>
-      </w:r>
-      <w:r>
-        <w:t xml:space="preserve">large</w:t>
-      </w:r>
-      <w:r>
-        <w:t xml:space="preserve"> </w:t>
-      </w:r>
-      <w:r>
-        <w:t xml:space="preserve">maps.</w:t>
+        <w:t xml:space="preserve">larger</w:t>
+      </w:r>
+      <w:r>
+        <w:t xml:space="preserve"> </w:t>
+      </w:r>
+      <w:r>
+        <w:t xml:space="preserve">sizes.</w:t>
       </w:r>
     </w:p>
     <w:p>
@@ -1674,13 +1788,58 @@
               <w:pStyle w:val="ImageCaption"/>
             </w:pPr>
             <w:r>
-              <w:t xml:space="preserve">Figure 1: Design of ggvmap. (A) The workflow: one computation function, one plot</w:t>
-            </w:r>
-            <w:r>
-              <w:t xml:space="preserve"> </w:t>
-            </w:r>
-            <w:r>
-              <w:t xml:space="preserve">function, pipe-able annotation verbs, and either static (</w:t>
+              <w:t xml:space="preserve">Figure 1: Design of ggvmap. (A) The workflow: a weight vector (with optional</w:t>
+            </w:r>
+            <w:r>
+              <w:t xml:space="preserve"> </w:t>
+            </w:r>
+            <w:r>
+              <w:t xml:space="preserve">labels and a grouping variable) flows through</w:t>
+            </w:r>
+            <w:r>
+              <w:t xml:space="preserve"> </w:t>
+            </w:r>
+            <w:r>
+              <w:rPr>
+                <w:rStyle w:val="VerbatimChar"/>
+              </w:rPr>
+              <w:t xml:space="preserve">voronoi_map()</w:t>
+            </w:r>
+            <w:r>
+              <w:t xml:space="preserve">, which</w:t>
+            </w:r>
+            <w:r>
+              <w:t xml:space="preserve"> </w:t>
+            </w:r>
+            <w:r>
+              <w:t xml:space="preserve">computes the tessellation, into</w:t>
+            </w:r>
+            <w:r>
+              <w:t xml:space="preserve"> </w:t>
+            </w:r>
+            <w:r>
+              <w:rPr>
+                <w:rStyle w:val="VerbatimChar"/>
+              </w:rPr>
+              <w:t xml:space="preserve">ggvmap()</w:t>
+            </w:r>
+            <w:r>
+              <w:t xml:space="preserve">, which renders it; annotation</w:t>
+            </w:r>
+            <w:r>
+              <w:t xml:space="preserve"> </w:t>
+            </w:r>
+            <w:r>
+              <w:t xml:space="preserve">verbs are chained with R’s native pipe, and the result is written to file</w:t>
+            </w:r>
+            <w:r>
+              <w:t xml:space="preserve"> </w:t>
+            </w:r>
+            <w:r>
+              <w:t xml:space="preserve">with</w:t>
+            </w:r>
+            <w:r>
+              <w:t xml:space="preserve"> </w:t>
             </w:r>
             <w:r>
               <w:rPr>
@@ -1689,13 +1848,13 @@
               <w:t xml:space="preserve">ggsave()</w:t>
             </w:r>
             <w:r>
-              <w:t xml:space="preserve">) or</w:t>
-            </w:r>
-            <w:r>
-              <w:t xml:space="preserve"> </w:t>
-            </w:r>
-            <w:r>
-              <w:t xml:space="preserve">interactive (</w:t>
+              <w:t xml:space="preserve"> </w:t>
+            </w:r>
+            <w:r>
+              <w:t xml:space="preserve">or made interactive with</w:t>
+            </w:r>
+            <w:r>
+              <w:t xml:space="preserve"> </w:t>
             </w:r>
             <w:r>
               <w:rPr>
@@ -1704,7 +1863,19 @@
               <w:t xml:space="preserve">vm_girafe()</w:t>
             </w:r>
             <w:r>
-              <w:t xml:space="preserve">) output. (B) From data to plot: the bundled</w:t>
+              <w:t xml:space="preserve">. (B) From data to</w:t>
+            </w:r>
+            <w:r>
+              <w:t xml:space="preserve"> </w:t>
+            </w:r>
+            <w:r>
+              <w:t xml:space="preserve">plot: the nine lines of code shown produce the finished infographic below</w:t>
+            </w:r>
+            <w:r>
+              <w:t xml:space="preserve"> </w:t>
+            </w:r>
+            <w:r>
+              <w:t xml:space="preserve">them from the bundled</w:t>
             </w:r>
             <w:r>
               <w:t xml:space="preserve"> </w:t>
@@ -1719,7 +1890,49 @@
               <w:t xml:space="preserve"> </w:t>
             </w:r>
             <w:r>
-              <w:t xml:space="preserve">dataset (share of global renewable freshwater resources, 2022</w:t>
+              <w:t xml:space="preserve">dataset (columns</w:t>
+            </w:r>
+            <w:r>
+              <w:t xml:space="preserve"> </w:t>
+            </w:r>
+            <w:r>
+              <w:rPr>
+                <w:rStyle w:val="VerbatimChar"/>
+              </w:rPr>
+              <w:t xml:space="preserve">country</w:t>
+            </w:r>
+            <w:r>
+              <w:t xml:space="preserve">,</w:t>
+            </w:r>
+            <w:r>
+              <w:t xml:space="preserve"> </w:t>
+            </w:r>
+            <w:r>
+              <w:rPr>
+                <w:rStyle w:val="VerbatimChar"/>
+              </w:rPr>
+              <w:t xml:space="preserve">share</w:t>
+            </w:r>
+            <w:r>
+              <w:t xml:space="preserve">,</w:t>
+            </w:r>
+            <w:r>
+              <w:t xml:space="preserve"> </w:t>
+            </w:r>
+            <w:r>
+              <w:rPr>
+                <w:rStyle w:val="VerbatimChar"/>
+              </w:rPr>
+              <w:t xml:space="preserve">region</w:t>
+            </w:r>
+            <w:r>
+              <w:t xml:space="preserve">; each country’s share of global renewable freshwater resources,</w:t>
+            </w:r>
+            <w:r>
+              <w:t xml:space="preserve"> </w:t>
+            </w:r>
+            <w:r>
+              <w:t xml:space="preserve">2022</w:t>
             </w:r>
             <w:r>
               <w:t xml:space="preserve"> </w:t>
@@ -1728,13 +1941,73 @@
               <w:t xml:space="preserve">(Food and Agriculture Organization of the United Nations 2022)</w:t>
             </w:r>
             <w:r>
-              <w:t xml:space="preserve">) rendered by the code shown. (C) The annotation-layer verbs.</w:t>
-            </w:r>
-            <w:r>
-              <w:t xml:space="preserve"> </w:t>
-            </w:r>
-            <w:r>
-              <w:t xml:space="preserve">(D) The three levels of appearance control.</w:t>
+              <w:t xml:space="preserve">). Every cell is a country with area proportional to its</w:t>
+            </w:r>
+            <w:r>
+              <w:t xml:space="preserve"> </w:t>
+            </w:r>
+            <w:r>
+              <w:t xml:space="preserve">share, colour and sector encode the region, values sit beneath the names</w:t>
+            </w:r>
+            <w:r>
+              <w:t xml:space="preserve"> </w:t>
+            </w:r>
+            <w:r>
+              <w:t xml:space="preserve">(shrunk or hidden in the smallest cells), and the outer arc ring carries</w:t>
+            </w:r>
+            <w:r>
+              <w:t xml:space="preserve"> </w:t>
+            </w:r>
+            <w:r>
+              <w:t xml:space="preserve">each region’s total share. (C) The complete exported vocabulary, grouped by</w:t>
+            </w:r>
+            <w:r>
+              <w:t xml:space="preserve"> </w:t>
+            </w:r>
+            <w:r>
+              <w:t xml:space="preserve">role: one computation function; four output functions; four pipe-able</w:t>
+            </w:r>
+            <w:r>
+              <w:t xml:space="preserve"> </w:t>
+            </w:r>
+            <w:r>
+              <w:t xml:space="preserve">annotation verbs; accessors that return tidy data frames for custom</w:t>
+            </w:r>
+            <w:r>
+              <w:t xml:space="preserve"> </w:t>
+            </w:r>
+            <w:r>
+              <w:t xml:space="preserve">ggplot2 work; the colour and flag helpers; and the ten convex boundary</w:t>
+            </w:r>
+            <w:r>
+              <w:t xml:space="preserve"> </w:t>
+            </w:r>
+            <w:r>
+              <w:t xml:space="preserve">constructors. (D) Appearance arguments by the level they act on – whole</w:t>
+            </w:r>
+            <w:r>
+              <w:t xml:space="preserve"> </w:t>
+            </w:r>
+            <w:r>
+              <w:t xml:space="preserve">map, group, or single cell. Every cell-level argument also accepts a</w:t>
+            </w:r>
+            <w:r>
+              <w:t xml:space="preserve"> </w:t>
+            </w:r>
+            <w:r>
+              <w:t xml:space="preserve">vector named by cell label, so emphasising one cell (bold face, different</w:t>
+            </w:r>
+            <w:r>
+              <w:t xml:space="preserve"> </w:t>
+            </w:r>
+            <w:r>
+              <w:t xml:space="preserve">colour, its own label) is a one-argument change with no data</w:t>
+            </w:r>
+            <w:r>
+              <w:t xml:space="preserve"> </w:t>
+            </w:r>
+            <w:r>
+              <w:t xml:space="preserve">manipulation.</w:t>
             </w:r>
           </w:p>
           <w:bookmarkEnd w:id="24"/>
@@ -1897,31 +2170,181 @@
               <w:pStyle w:val="ImageCaption"/>
             </w:pPr>
             <w:r>
-              <w:t xml:space="preserve">Figure 2: Gallery. All panels are drawn from</w:t>
-            </w:r>
-            <w:r>
-              <w:t xml:space="preserve"> </w:t>
+              <w:t xml:space="preserve">Figure 2: Gallery: one dataset, fourteen maps. Rows 1–2: the ten largest</w:t>
+            </w:r>
+            <w:r>
+              <w:t xml:space="preserve"> </w:t>
+            </w:r>
+            <w:r>
+              <w:t xml:space="preserve">freshwater-holding countries laid out on each of the nine built-in convex</w:t>
+            </w:r>
+            <w:r>
+              <w:t xml:space="preserve"> </w:t>
+            </w:r>
+            <w:r>
+              <w:t xml:space="preserve">boundaries – the identical weight vector fills any convex shape with</w:t>
+            </w:r>
+            <w:r>
+              <w:t xml:space="preserve"> </w:t>
+            </w:r>
+            <w:r>
+              <w:t xml:space="preserve">area-true cells, so the boundary is a free design choice. Row 3, left to</w:t>
+            </w:r>
+            <w:r>
+              <w:t xml:space="preserve"> </w:t>
+            </w:r>
+            <w:r>
+              <w:t xml:space="preserve">right: the full 30-row dataset in a hierarchical layout (one sector per</w:t>
+            </w:r>
+            <w:r>
+              <w:t xml:space="preserve"> </w:t>
+            </w:r>
+            <w:r>
+              <w:t xml:space="preserve">region) with the LATAM region singled out by a dark border</w:t>
+            </w:r>
+            <w:r>
+              <w:t xml:space="preserve"> </w:t>
+            </w:r>
+            <w:r>
+              <w:t xml:space="preserve">(</w:t>
             </w:r>
             <w:r>
               <w:rPr>
                 <w:rStyle w:val="VerbatimChar"/>
               </w:rPr>
-              <w:t xml:space="preserve">data(freshwater)</w:t>
-            </w:r>
-            <w:r>
-              <w:t xml:space="preserve">: the nine built-in</w:t>
-            </w:r>
-            <w:r>
-              <w:t xml:space="preserve"> </w:t>
-            </w:r>
-            <w:r>
-              <w:t xml:space="preserve">convex boundaries (rows 1–2), and the grouped layout, ring styles,</w:t>
-            </w:r>
-            <w:r>
-              <w:t xml:space="preserve"> </w:t>
-            </w:r>
-            <w:r>
-              <w:t xml:space="preserve">continuous fill, and flags (row 3).</w:t>
+              <w:t xml:space="preserve">group_border_col = c(LATAM = "#333333")</w:t>
+            </w:r>
+            <w:r>
+              <w:t xml:space="preserve">); the filled</w:t>
+            </w:r>
+            <w:r>
+              <w:t xml:space="preserve"> </w:t>
+            </w:r>
+            <w:r>
+              <w:rPr>
+                <w:rStyle w:val="VerbatimChar"/>
+              </w:rPr>
+              <w:t xml:space="preserve">"band"</w:t>
+            </w:r>
+            <w:r>
+              <w:t xml:space="preserve"> </w:t>
+            </w:r>
+            <w:r>
+              <w:t xml:space="preserve">ring</w:t>
+            </w:r>
+            <w:r>
+              <w:t xml:space="preserve"> </w:t>
+            </w:r>
+            <w:r>
+              <w:t xml:space="preserve">style, where each segment spans the angular extent of its region’s sector;</w:t>
+            </w:r>
+            <w:r>
+              <w:t xml:space="preserve"> </w:t>
+            </w:r>
+            <w:r>
+              <w:t xml:space="preserve">the thin</w:t>
+            </w:r>
+            <w:r>
+              <w:t xml:space="preserve"> </w:t>
+            </w:r>
+            <w:r>
+              <w:rPr>
+                <w:rStyle w:val="VerbatimChar"/>
+              </w:rPr>
+              <w:t xml:space="preserve">"arc"</w:t>
+            </w:r>
+            <w:r>
+              <w:t xml:space="preserve"> </w:t>
+            </w:r>
+            <w:r>
+              <w:t xml:space="preserve">ring style with each region’s share appended to its label</w:t>
+            </w:r>
+            <w:r>
+              <w:t xml:space="preserve"> </w:t>
+            </w:r>
+            <w:r>
+              <w:t xml:space="preserve">(</w:t>
+            </w:r>
+            <w:r>
+              <w:rPr>
+                <w:rStyle w:val="VerbatimChar"/>
+              </w:rPr>
+              <w:t xml:space="preserve">values = TRUE</w:t>
+            </w:r>
+            <w:r>
+              <w:t xml:space="preserve">); continuous fill mapped to cell weight</w:t>
+            </w:r>
+            <w:r>
+              <w:t xml:space="preserve"> </w:t>
+            </w:r>
+            <w:r>
+              <w:t xml:space="preserve">(</w:t>
+            </w:r>
+            <w:r>
+              <w:rPr>
+                <w:rStyle w:val="VerbatimChar"/>
+              </w:rPr>
+              <w:t xml:space="preserve">fill_by = "data_weight"</w:t>
+            </w:r>
+            <w:r>
+              <w:t xml:space="preserve">), turning the map into a treemap-heatmap</w:t>
+            </w:r>
+            <w:r>
+              <w:t xml:space="preserve"> </w:t>
+            </w:r>
+            <w:r>
+              <w:t xml:space="preserve">hybrid; and national flags resolved automatically from the country names</w:t>
+            </w:r>
+            <w:r>
+              <w:t xml:space="preserve"> </w:t>
+            </w:r>
+            <w:r>
+              <w:t xml:space="preserve">(</w:t>
+            </w:r>
+            <w:r>
+              <w:rPr>
+                <w:rStyle w:val="VerbatimChar"/>
+              </w:rPr>
+              <w:t xml:space="preserve">vm_add_flags()</w:t>
+            </w:r>
+            <w:r>
+              <w:t xml:space="preserve">). Throughout, labels in small cells shrink</w:t>
+            </w:r>
+            <w:r>
+              <w:t xml:space="preserve"> </w:t>
+            </w:r>
+            <w:r>
+              <w:t xml:space="preserve">(</w:t>
+            </w:r>
+            <w:r>
+              <w:rPr>
+                <w:rStyle w:val="VerbatimChar"/>
+              </w:rPr>
+              <w:t xml:space="preserve">autoscale = TRUE</w:t>
+            </w:r>
+            <w:r>
+              <w:t xml:space="preserve">) or disappear below an area threshold (</w:t>
+            </w:r>
+            <w:r>
+              <w:rPr>
+                <w:rStyle w:val="VerbatimChar"/>
+              </w:rPr>
+              <w:t xml:space="preserve">min_area</w:t>
+            </w:r>
+            <w:r>
+              <w:t xml:space="preserve">),</w:t>
+            </w:r>
+            <w:r>
+              <w:t xml:space="preserve"> </w:t>
+            </w:r>
+            <w:r>
+              <w:t xml:space="preserve">keeping long-tailed data legible without manual</w:t>
+            </w:r>
+            <w:r>
+              <w:t xml:space="preserve"> </w:t>
+            </w:r>
+            <w:r>
+              <w:t xml:space="preserve">tuning.</w:t>
             </w:r>
           </w:p>
           <w:bookmarkEnd w:id="29"/>
@@ -2060,7 +2483,13 @@
               <w:pStyle w:val="ImageCaption"/>
             </w:pPr>
             <w:r>
-              <w:t xml:space="preserve">Figure 3: Use cases (simulated data; scripts in</w:t>
+              <w:t xml:space="preserve">Figure 3: Use cases across disciplines. All data are simulated but realistic, and</w:t>
+            </w:r>
+            <w:r>
+              <w:t xml:space="preserve"> </w:t>
+            </w:r>
+            <w:r>
+              <w:t xml:space="preserve">each panel’s complete script ships in</w:t>
             </w:r>
             <w:r>
               <w:t xml:space="preserve"> </w:t>
@@ -2069,34 +2498,106 @@
               <w:rPr>
                 <w:rStyle w:val="VerbatimChar"/>
               </w:rPr>
-              <w:t xml:space="preserve">paper/figures/</w:t>
-            </w:r>
-            <w:r>
-              <w:t xml:space="preserve">). (A) Gene</w:t>
-            </w:r>
-            <w:r>
-              <w:t xml:space="preserve"> </w:t>
-            </w:r>
-            <w:r>
-              <w:t xml:space="preserve">families grouped by functional class. (B) GWAS hits per chromosome,</w:t>
-            </w:r>
-            <w:r>
-              <w:t xml:space="preserve"> </w:t>
-            </w:r>
-            <w:r>
-              <w:t xml:space="preserve">continuous fill. (C) RNA-seq library composition with the contaminant</w:t>
-            </w:r>
-            <w:r>
-              <w:t xml:space="preserve"> </w:t>
-            </w:r>
-            <w:r>
-              <w:t xml:space="preserve">group outlined. (D) Household expenditure by need</w:t>
-            </w:r>
-            <w:r>
-              <w:t xml:space="preserve"> </w:t>
-            </w:r>
-            <w:r>
-              <w:t xml:space="preserve">category.</w:t>
+              <w:t xml:space="preserve">paper/figures/fig3_usecases.R</w:t>
+            </w:r>
+            <w:r>
+              <w:t xml:space="preserve"> </w:t>
+            </w:r>
+            <w:r>
+              <w:t xml:space="preserve">as a</w:t>
+            </w:r>
+            <w:r>
+              <w:t xml:space="preserve"> </w:t>
+            </w:r>
+            <w:r>
+              <w:t xml:space="preserve">drop-in template. (A) Genomics: twelve large gene families sized by gene</w:t>
+            </w:r>
+            <w:r>
+              <w:t xml:space="preserve"> </w:t>
+            </w:r>
+            <w:r>
+              <w:t xml:space="preserve">count and grouped by functional class; the arc ring reports each class’s</w:t>
+            </w:r>
+            <w:r>
+              <w:t xml:space="preserve"> </w:t>
+            </w:r>
+            <w:r>
+              <w:t xml:space="preserve">share of the depicted families, and light-on-dark label colours keep the</w:t>
+            </w:r>
+            <w:r>
+              <w:t xml:space="preserve"> </w:t>
+            </w:r>
+            <w:r>
+              <w:t xml:space="preserve">dark Regulation sector readable. (B) Genetics: simulated genome-wide</w:t>
+            </w:r>
+            <w:r>
+              <w:t xml:space="preserve"> </w:t>
+            </w:r>
+            <w:r>
+              <w:t xml:space="preserve">association hits per human chromosome (weights roughly proportional to</w:t>
+            </w:r>
+            <w:r>
+              <w:t xml:space="preserve"> </w:t>
+            </w:r>
+            <w:r>
+              <w:t xml:space="preserve">chromosome length) on a rectangular boundary, with continuous fill</w:t>
+            </w:r>
+            <w:r>
+              <w:t xml:space="preserve"> </w:t>
+            </w:r>
+            <w:r>
+              <w:t xml:space="preserve">restating each cell’s weight so hot chromosomes stand out twice – by area</w:t>
+            </w:r>
+            <w:r>
+              <w:t xml:space="preserve"> </w:t>
+            </w:r>
+            <w:r>
+              <w:t xml:space="preserve">and by colour. (C) Transcriptomics: where the reads of an RNA-seq library</w:t>
+            </w:r>
+            <w:r>
+              <w:t xml:space="preserve"> </w:t>
+            </w:r>
+            <w:r>
+              <w:t xml:space="preserve">end up, grouped into signal, contaminant, and noise classes; the</w:t>
+            </w:r>
+            <w:r>
+              <w:t xml:space="preserve"> </w:t>
+            </w:r>
+            <w:r>
+              <w:t xml:space="preserve">contaminant class is outlined dark for emphasis and fractions below 2% of</w:t>
+            </w:r>
+            <w:r>
+              <w:t xml:space="preserve"> </w:t>
+            </w:r>
+            <w:r>
+              <w:t xml:space="preserve">the library lose their labels (</w:t>
+            </w:r>
+            <w:r>
+              <w:rPr>
+                <w:rStyle w:val="VerbatimChar"/>
+              </w:rPr>
+              <w:t xml:space="preserve">min_area</w:t>
+            </w:r>
+            <w:r>
+              <w:t xml:space="preserve">). (D) Social science: household</w:t>
+            </w:r>
+            <w:r>
+              <w:t xml:space="preserve"> </w:t>
+            </w:r>
+            <w:r>
+              <w:t xml:space="preserve">expenditure shares grouped by need category, the same</w:t>
+            </w:r>
+            <w:r>
+              <w:t xml:space="preserve"> </w:t>
+            </w:r>
+            <w:r>
+              <w:t xml:space="preserve">hierarchy-plus-arc-ring pattern as panel A applied to survey-style</w:t>
+            </w:r>
+            <w:r>
+              <w:t xml:space="preserve"> </w:t>
+            </w:r>
+            <w:r>
+              <w:t xml:space="preserve">data.</w:t>
             </w:r>
           </w:p>
           <w:bookmarkEnd w:id="34"/>
@@ -2135,7 +2636,7 @@
         <w:t xml:space="preserve"> </w:t>
       </w:r>
       <w:r>
-        <w:t xml:space="preserve">WeightedTreemaps on four axes.</w:t>
+        <w:t xml:space="preserve">WeightedTreemaps on four axes, each package at its default settings.</w:t>
       </w:r>
       <w:r>
         <w:t xml:space="preserve"> </w:t>
@@ -2148,7 +2649,24 @@
         <w:t xml:space="preserve">Install complexity</w:t>
       </w:r>
       <w:r>
-        <w:t xml:space="preserve">: ggvmap needs</w:t>
+        <w:t xml:space="preserve"> </w:t>
+      </w:r>
+      <w:r>
+        <w:t xml:space="preserve">(</w:t>
+      </w:r>
+      <w:hyperlink w:anchor="fig-benchmark">
+        <w:r>
+          <w:rPr>
+            <w:rStyle w:val="Hyperlink"/>
+          </w:rPr>
+          <w:t xml:space="preserve">Figure 4</w:t>
+        </w:r>
+      </w:hyperlink>
+      <w:r>
+        <w:t xml:space="preserve"> </w:t>
+      </w:r>
+      <w:r>
+        <w:t xml:space="preserve">A): ggvmap needs</w:t>
       </w:r>
       <w:r>
         <w:t xml:space="preserve"> </w:t>
@@ -2166,13 +2684,13 @@
         <w:t xml:space="preserve"> </w:t>
       </w:r>
       <w:r>
-        <w:t xml:space="preserve">WeightedTreemaps; voronoiTreemap installs many htmlwidgets dependencies and</w:t>
-      </w:r>
-      <w:r>
-        <w:t xml:space="preserve"> </w:t>
-      </w:r>
-      <w:r>
-        <w:t xml:space="preserve">runs its layout in a browser.</w:t>
+        <w:t xml:space="preserve">WeightedTreemaps; voronoiTreemap resolves 44 packages and runs its layout</w:t>
+      </w:r>
+      <w:r>
+        <w:t xml:space="preserve"> </w:t>
+      </w:r>
+      <w:r>
+        <w:t xml:space="preserve">in a browser.</w:t>
       </w:r>
       <w:r>
         <w:t xml:space="preserve"> </w:t>
@@ -2185,13 +2703,30 @@
         <w:t xml:space="preserve">Code length</w:t>
       </w:r>
       <w:r>
-        <w:t xml:space="preserve">: the same grouped treemap takes</w:t>
-      </w:r>
-      <w:r>
-        <w:t xml:space="preserve"> </w:t>
-      </w:r>
-      <w:r>
-        <w:t xml:space="preserve">the fewest words, characters, and function calls in ggvmap.</w:t>
+        <w:t xml:space="preserve"> </w:t>
+      </w:r>
+      <w:r>
+        <w:t xml:space="preserve">(</w:t>
+      </w:r>
+      <w:hyperlink w:anchor="fig-benchmark">
+        <w:r>
+          <w:rPr>
+            <w:rStyle w:val="Hyperlink"/>
+          </w:rPr>
+          <w:t xml:space="preserve">Figure 4</w:t>
+        </w:r>
+      </w:hyperlink>
+      <w:r>
+        <w:t xml:space="preserve"> </w:t>
+      </w:r>
+      <w:r>
+        <w:t xml:space="preserve">B): the same grouped treemap</w:t>
+      </w:r>
+      <w:r>
+        <w:t xml:space="preserve"> </w:t>
+      </w:r>
+      <w:r>
+        <w:t xml:space="preserve">takes the fewest words, characters, and function calls in ggvmap.</w:t>
       </w:r>
       <w:r>
         <w:t xml:space="preserve"> </w:t>
@@ -2204,55 +2739,66 @@
         <w:t xml:space="preserve">Runtime</w:t>
       </w:r>
       <w:r>
-        <w:t xml:space="preserve">: the</w:t>
-      </w:r>
-      <w:r>
-        <w:t xml:space="preserve"> </w:t>
-      </w:r>
-      <w:r>
-        <w:t xml:space="preserve">picture is size-dependent. At small maps ggvmap is the faster of the two</w:t>
-      </w:r>
-      <w:r>
-        <w:t xml:space="preserve"> </w:t>
-      </w:r>
-      <w:r>
-        <w:t xml:space="preserve">measurable implementations – 68 ms versus</w:t>
-      </w:r>
-      <w:r>
-        <w:t xml:space="preserve"> </w:t>
-      </w:r>
-      <w:r>
-        <w:t xml:space="preserve">664 ms at n = 10 and 2.5 s versus</w:t>
-      </w:r>
-      <w:r>
-        <w:t xml:space="preserve"> </w:t>
-      </w:r>
-      <w:r>
-        <w:t xml:space="preserve">4.5 s at n = 50 – because it avoids the fixed setup</w:t>
-      </w:r>
-      <w:r>
-        <w:t xml:space="preserve"> </w:t>
-      </w:r>
-      <w:r>
-        <w:t xml:space="preserve">cost of the compiled pipeline. Beyond that, pure R pays its price: at</w:t>
-      </w:r>
-      <w:r>
-        <w:t xml:space="preserve"> </w:t>
-      </w:r>
-      <w:r>
-        <w:t xml:space="preserve">n = 100 ggvmap needs 33.4 s versus</w:t>
-      </w:r>
-      <w:r>
-        <w:t xml:space="preserve"> </w:t>
-      </w:r>
-      <w:r>
-        <w:t xml:space="preserve">5.5 s, and at n = 500 the gap is</w:t>
-      </w:r>
-      <w:r>
-        <w:t xml:space="preserve"> </w:t>
-      </w:r>
-      <w:r>
-        <w:t xml:space="preserve">30-fold</w:t>
+        <w:t xml:space="preserve"> </w:t>
+      </w:r>
+      <w:r>
+        <w:t xml:space="preserve">(</w:t>
+      </w:r>
+      <w:hyperlink w:anchor="fig-benchmark">
+        <w:r>
+          <w:rPr>
+            <w:rStyle w:val="Hyperlink"/>
+          </w:rPr>
+          <w:t xml:space="preserve">Figure 4</w:t>
+        </w:r>
+      </w:hyperlink>
+      <w:r>
+        <w:t xml:space="preserve"> </w:t>
+      </w:r>
+      <w:r>
+        <w:t xml:space="preserve">C) is size-dependent. On small maps ggvmap is</w:t>
+      </w:r>
+      <w:r>
+        <w:t xml:space="preserve"> </w:t>
+      </w:r>
+      <w:r>
+        <w:t xml:space="preserve">the faster of the two measurable implementations –</w:t>
+      </w:r>
+      <w:r>
+        <w:t xml:space="preserve"> </w:t>
+      </w:r>
+      <w:r>
+        <w:t xml:space="preserve">68 ms versus 664 ms at n = 10 and</w:t>
+      </w:r>
+      <w:r>
+        <w:t xml:space="preserve"> </w:t>
+      </w:r>
+      <w:r>
+        <w:t xml:space="preserve">2.5 s versus 4.5 s at n = 50 –</w:t>
+      </w:r>
+      <w:r>
+        <w:t xml:space="preserve"> </w:t>
+      </w:r>
+      <w:r>
+        <w:t xml:space="preserve">because it avoids the fixed setup cost of the compiled pipeline. Beyond</w:t>
+      </w:r>
+      <w:r>
+        <w:t xml:space="preserve"> </w:t>
+      </w:r>
+      <w:r>
+        <w:t xml:space="preserve">that, pure R pays its price: 33.4 s versus</w:t>
+      </w:r>
+      <w:r>
+        <w:t xml:space="preserve"> </w:t>
+      </w:r>
+      <w:r>
+        <w:t xml:space="preserve">5.5 s at n = 100, and a</w:t>
+      </w:r>
+      <w:r>
+        <w:t xml:space="preserve"> </w:t>
+      </w:r>
+      <w:r>
+        <w:t xml:space="preserve">30-fold gap at n = 500</w:t>
       </w:r>
       <w:r>
         <w:t xml:space="preserve"> </w:t>
@@ -2270,17 +2816,19 @@
         <w:t xml:space="preserve"> </w:t>
       </w:r>
       <w:r>
-        <w:t xml:space="preserve">faster; for maps of many hundreds or thousands of cells, WeightedTreemaps</w:t>
-      </w:r>
-      <w:r>
-        <w:t xml:space="preserve"> </w:t>
-      </w:r>
-      <w:r>
-        <w:t xml:space="preserve">is the right tool.</w:t>
-      </w:r>
-      <w:r>
-        <w:t xml:space="preserve"> </w:t>
-      </w:r>
+        <w:t xml:space="preserve">faster; for maps of many hundreds of cells, WeightedTreemaps is the right</w:t>
+      </w:r>
+      <w:r>
+        <w:t xml:space="preserve"> </w:t>
+      </w:r>
+      <w:r>
+        <w:t xml:space="preserve">tool.</w:t>
+      </w:r>
+    </w:p>
+    <w:p>
+      <w:pPr>
+        <w:pStyle w:val="BodyText"/>
+      </w:pPr>
       <w:r>
         <w:rPr>
           <w:iCs/>
@@ -2289,19 +2837,156 @@
         <w:t xml:space="preserve">Accuracy</w:t>
       </w:r>
       <w:r>
-        <w:t xml:space="preserve">: on these deliberately long-tailed</w:t>
-      </w:r>
-      <w:r>
-        <w:t xml:space="preserve"> </w:t>
-      </w:r>
-      <w:r>
-        <w:t xml:space="preserve">lognormal weights, both implementations concentrate their error in the very</w:t>
-      </w:r>
-      <w:r>
-        <w:t xml:space="preserve"> </w:t>
-      </w:r>
-      <w:r>
-        <w:t xml:space="preserve">smallest cells, whose target areas are near zero – a large</w:t>
+        <w:t xml:space="preserve"> </w:t>
+      </w:r>
+      <w:r>
+        <w:t xml:space="preserve">(</w:t>
+      </w:r>
+      <w:hyperlink w:anchor="fig-benchmark">
+        <w:r>
+          <w:rPr>
+            <w:rStyle w:val="Hyperlink"/>
+          </w:rPr>
+          <w:t xml:space="preserve">Figure 4</w:t>
+        </w:r>
+      </w:hyperlink>
+      <w:r>
+        <w:t xml:space="preserve"> </w:t>
+      </w:r>
+      <w:r>
+        <w:t xml:space="preserve">D) turns out to measure convergence, not</w:t>
+      </w:r>
+      <w:r>
+        <w:t xml:space="preserve"> </w:t>
+      </w:r>
+      <w:r>
+        <w:t xml:space="preserve">intrinsic layout quality. At n = 10 and n = 50 the layout converges below</w:t>
+      </w:r>
+      <w:r>
+        <w:t xml:space="preserve"> </w:t>
+      </w:r>
+      <w:r>
+        <w:t xml:space="preserve">the default 1% area-error threshold within 32 and 63 iterations, giving</w:t>
+      </w:r>
+      <w:r>
+        <w:t xml:space="preserve"> </w:t>
+      </w:r>
+      <w:r>
+        <w:t xml:space="preserve">2% and 2%</w:t>
+      </w:r>
+      <w:r>
+        <w:t xml:space="preserve"> </w:t>
+      </w:r>
+      <w:r>
+        <w:t xml:space="preserve">mean relative cell-area error. The n = 100 and n = 500 instances exhaust</w:t>
+      </w:r>
+      <w:r>
+        <w:t xml:space="preserve"> </w:t>
+      </w:r>
+      <w:r>
+        <w:t xml:space="preserve">the default budget of 200 iterations before converging; the stopped</w:t>
+      </w:r>
+      <w:r>
+        <w:t xml:space="preserve"> </w:t>
+      </w:r>
+      <w:r>
+        <w:t xml:space="preserve">layouts show 57% and</w:t>
+      </w:r>
+      <w:r>
+        <w:t xml:space="preserve"> </w:t>
+      </w:r>
+      <w:r>
+        <w:t xml:space="preserve">12% mean error, and the n = 100 draw –</w:t>
+      </w:r>
+      <w:r>
+        <w:t xml:space="preserve"> </w:t>
+      </w:r>
+      <w:r>
+        <w:t xml:space="preserve">whose lognormal weights span a 128-fold range – is the hardest of the</w:t>
+      </w:r>
+      <w:r>
+        <w:t xml:space="preserve"> </w:t>
+      </w:r>
+      <w:r>
+        <w:t xml:space="preserve">four. This is an iteration-budget artefact, not a ceiling: rerunning the</w:t>
+      </w:r>
+      <w:r>
+        <w:t xml:space="preserve"> </w:t>
+      </w:r>
+      <w:r>
+        <w:t xml:space="preserve">same n = 100 instance with</w:t>
+      </w:r>
+      <w:r>
+        <w:t xml:space="preserve"> </w:t>
+      </w:r>
+      <w:r>
+        <w:rPr>
+          <w:rStyle w:val="VerbatimChar"/>
+        </w:rPr>
+        <w:t xml:space="preserve">max_iter = 500</w:t>
+      </w:r>
+      <w:r>
+        <w:t xml:space="preserve"> </w:t>
+      </w:r>
+      <w:r>
+        <w:t xml:space="preserve">converges after 383 iterations</w:t>
+      </w:r>
+      <w:r>
+        <w:t xml:space="preserve"> </w:t>
+      </w:r>
+      <w:r>
+        <w:t xml:space="preserve">to 2.3% mean error (63 s). ggvmap is deliberately transparent about this:</w:t>
+      </w:r>
+      <w:r>
+        <w:t xml:space="preserve"> </w:t>
+      </w:r>
+      <w:r>
+        <w:t xml:space="preserve">the returned object carries a</w:t>
+      </w:r>
+      <w:r>
+        <w:t xml:space="preserve"> </w:t>
+      </w:r>
+      <w:r>
+        <w:rPr>
+          <w:rStyle w:val="VerbatimChar"/>
+        </w:rPr>
+        <w:t xml:space="preserve">converged</w:t>
+      </w:r>
+      <w:r>
+        <w:t xml:space="preserve"> </w:t>
+      </w:r>
+      <w:r>
+        <w:t xml:space="preserve">flag and the iteration count.</w:t>
+      </w:r>
+      <w:r>
+        <w:t xml:space="preserve"> </w:t>
+      </w:r>
+      <w:r>
+        <w:t xml:space="preserve">WeightedTreemaps shows the same budget-dependence under its own defaults</w:t>
+      </w:r>
+      <w:r>
+        <w:t xml:space="preserve"> </w:t>
+      </w:r>
+      <w:r>
+        <w:t xml:space="preserve">(5% to</w:t>
+      </w:r>
+      <w:r>
+        <w:t xml:space="preserve"> </w:t>
+      </w:r>
+      <w:r>
+        <w:t xml:space="preserve">42% across sizes), and both</w:t>
+      </w:r>
+      <w:r>
+        <w:t xml:space="preserve"> </w:t>
+      </w:r>
+      <w:r>
+        <w:t xml:space="preserve">implementations concentrate their largest relative errors in the smallest</w:t>
+      </w:r>
+      <w:r>
+        <w:t xml:space="preserve"> </w:t>
+      </w:r>
+      <w:r>
+        <w:t xml:space="preserve">cells, where the target area is near zero and a large</w:t>
       </w:r>
       <w:r>
         <w:t xml:space="preserve"> </w:t>
@@ -2317,49 +3002,25 @@
         <w:t xml:space="preserve"> </w:t>
       </w:r>
       <w:r>
-        <w:t xml:space="preserve">error there is visually invisible. Mean relative cell-area error for</w:t>
-      </w:r>
-      <w:r>
-        <w:t xml:space="preserve"> </w:t>
-      </w:r>
-      <w:r>
-        <w:t xml:space="preserve">ggvmap ranges from 2% to</w:t>
-      </w:r>
-      <w:r>
-        <w:t xml:space="preserve"> </w:t>
-      </w:r>
-      <w:r>
-        <w:t xml:space="preserve">57% across sizes, against</w:t>
-      </w:r>
-      <w:r>
-        <w:t xml:space="preserve"> </w:t>
-      </w:r>
-      <w:r>
-        <w:t xml:space="preserve">5% to</w:t>
-      </w:r>
-      <w:r>
-        <w:t xml:space="preserve"> </w:t>
-      </w:r>
-      <w:r>
-        <w:t xml:space="preserve">42% for WeightedTreemaps; ggvmap’s error</w:t>
-      </w:r>
-      <w:r>
-        <w:t xml:space="preserve"> </w:t>
-      </w:r>
-      <w:r>
-        <w:t xml:space="preserve">is the lower of the two at three of the four sizes. voronoiTreemap</w:t>
-      </w:r>
-      <w:r>
-        <w:t xml:space="preserve"> </w:t>
-      </w:r>
-      <w:r>
-        <w:t xml:space="preserve">computes its layout in the browser, so R-side runtime and accuracy are not</w:t>
-      </w:r>
-      <w:r>
-        <w:t xml:space="preserve"> </w:t>
-      </w:r>
-      <w:r>
-        <w:t xml:space="preserve">measurable and it appears only in the first two panels.</w:t>
+        <w:t xml:space="preserve">error is</w:t>
+      </w:r>
+      <w:r>
+        <w:t xml:space="preserve"> </w:t>
+      </w:r>
+      <w:r>
+        <w:t xml:space="preserve">visually invisible. voronoiTreemap computes its layout in the browser, so</w:t>
+      </w:r>
+      <w:r>
+        <w:t xml:space="preserve"> </w:t>
+      </w:r>
+      <w:r>
+        <w:t xml:space="preserve">R-side runtime and accuracy are not measurable; it appears only in panels</w:t>
+      </w:r>
+      <w:r>
+        <w:t xml:space="preserve"> </w:t>
+      </w:r>
+      <w:r>
+        <w:t xml:space="preserve">A–B.</w:t>
       </w:r>
     </w:p>
     <w:tbl>
@@ -2435,31 +3096,154 @@
               <w:pStyle w:val="ImageCaption"/>
             </w:pPr>
             <w:r>
-              <w:t xml:space="preserve">Figure 4: Benchmarks. (A) Recursive dependency count and compiled code. (B) Code</w:t>
-            </w:r>
-            <w:r>
-              <w:t xml:space="preserve"> </w:t>
-            </w:r>
-            <w:r>
-              <w:t xml:space="preserve">length for the same grouped treemap. (C) Runtime on flat maps of lognormal</w:t>
-            </w:r>
-            <w:r>
-              <w:t xml:space="preserve"> </w:t>
-            </w:r>
-            <w:r>
-              <w:t xml:space="preserve">weights (median of 10 runs; 3 at n = 500). (D) Mean relative cell-area</w:t>
-            </w:r>
-            <w:r>
-              <w:t xml:space="preserve"> </w:t>
-            </w:r>
-            <w:r>
-              <w:t xml:space="preserve">error. Panels C–D omit voronoiTreemap, whose layout runs in the</w:t>
-            </w:r>
-            <w:r>
-              <w:t xml:space="preserve"> </w:t>
-            </w:r>
-            <w:r>
-              <w:t xml:space="preserve">browser.</w:t>
+              <w:t xml:space="preserve">Figure 4: Benchmarks against the two existing R implementations, all packages at</w:t>
+            </w:r>
+            <w:r>
+              <w:t xml:space="preserve"> </w:t>
+            </w:r>
+            <w:r>
+              <w:t xml:space="preserve">default settings; the full protocol is in Methods and</w:t>
+            </w:r>
+            <w:r>
+              <w:t xml:space="preserve"> </w:t>
+            </w:r>
+            <w:r>
+              <w:rPr>
+                <w:rStyle w:val="VerbatimChar"/>
+              </w:rPr>
+              <w:t xml:space="preserve">paper/figures/fig4_benchmark.R</w:t>
+            </w:r>
+            <w:r>
+              <w:t xml:space="preserve">. (A) Install complexity: recursively</w:t>
+            </w:r>
+            <w:r>
+              <w:t xml:space="preserve"> </w:t>
+            </w:r>
+            <w:r>
+              <w:t xml:space="preserve">resolved CRAN dependencies (Depends, Imports, LinkingTo; base packages</w:t>
+            </w:r>
+            <w:r>
+              <w:t xml:space="preserve"> </w:t>
+            </w:r>
+            <w:r>
+              <w:t xml:space="preserve">excluded). ggvmap’s 17 are ggplot2 and its tree, with no compiled code;</w:t>
+            </w:r>
+            <w:r>
+              <w:t xml:space="preserve"> </w:t>
+            </w:r>
+            <w:r>
+              <w:t xml:space="preserve">WeightedTreemaps adds CGAL compilation; voronoiTreemap runs on the</w:t>
+            </w:r>
+            <w:r>
+              <w:t xml:space="preserve"> </w:t>
+            </w:r>
+            <w:r>
+              <w:t xml:space="preserve">htmlwidgets/D3 stack. (B) Code length for the same grouped treemap of</w:t>
+            </w:r>
+            <w:r>
+              <w:t xml:space="preserve"> </w:t>
+            </w:r>
+            <w:r>
+              <w:rPr>
+                <w:rStyle w:val="VerbatimChar"/>
+              </w:rPr>
+              <w:t xml:space="preserve">data(freshwater)</w:t>
+            </w:r>
+            <w:r>
+              <w:t xml:space="preserve">: lines, words, characters, and function calls of the</w:t>
+            </w:r>
+            <w:r>
+              <w:t xml:space="preserve"> </w:t>
+            </w:r>
+            <w:r>
+              <w:t xml:space="preserve">minimal script in each package (log scale; lower is better). (C) Median</w:t>
+            </w:r>
+            <w:r>
+              <w:t xml:space="preserve"> </w:t>
+            </w:r>
+            <w:r>
+              <w:t xml:space="preserve">layout runtime on flat maps of lognormal(3, 1) weights, log–log axes:</w:t>
+            </w:r>
+            <w:r>
+              <w:t xml:space="preserve"> </w:t>
+            </w:r>
+            <w:r>
+              <w:t xml:space="preserve">ggvmap (teal) is fastest up to n = 50, then the compiled implementation</w:t>
+            </w:r>
+            <w:r>
+              <w:t xml:space="preserve"> </w:t>
+            </w:r>
+            <w:r>
+              <w:t xml:space="preserve">(orange) pulls ahead – 33 s vs 5.5 s at n = 100 and 14.5 min vs 29 s at</w:t>
+            </w:r>
+            <w:r>
+              <w:t xml:space="preserve"> </w:t>
+            </w:r>
+            <w:r>
+              <w:t xml:space="preserve">n = 500. (D) Mean relative cell-area error, |actual - target| / target.</w:t>
+            </w:r>
+            <w:r>
+              <w:t xml:space="preserve"> </w:t>
+            </w:r>
+            <w:r>
+              <w:t xml:space="preserve">The ggvmap points at n = 100 and n = 500 are layouts stopped by the</w:t>
+            </w:r>
+            <w:r>
+              <w:t xml:space="preserve"> </w:t>
+            </w:r>
+            <w:r>
+              <w:t xml:space="preserve">default 200-iteration budget (the returned</w:t>
+            </w:r>
+            <w:r>
+              <w:t xml:space="preserve"> </w:t>
+            </w:r>
+            <w:r>
+              <w:rPr>
+                <w:rStyle w:val="VerbatimChar"/>
+              </w:rPr>
+              <w:t xml:space="preserve">converged</w:t>
+            </w:r>
+            <w:r>
+              <w:t xml:space="preserve"> </w:t>
+            </w:r>
+            <w:r>
+              <w:t xml:space="preserve">flag is</w:t>
+            </w:r>
+            <w:r>
+              <w:t xml:space="preserve"> </w:t>
+            </w:r>
+            <w:r>
+              <w:rPr>
+                <w:rStyle w:val="VerbatimChar"/>
+              </w:rPr>
+              <w:t xml:space="preserve">FALSE</w:t>
+            </w:r>
+            <w:r>
+              <w:t xml:space="preserve">);</w:t>
+            </w:r>
+            <w:r>
+              <w:t xml:space="preserve"> </w:t>
+            </w:r>
+            <w:r>
+              <w:t xml:space="preserve">the same n = 100 instance converges to 2.3% mean error given</w:t>
+            </w:r>
+            <w:r>
+              <w:t xml:space="preserve"> </w:t>
+            </w:r>
+            <w:r>
+              <w:rPr>
+                <w:rStyle w:val="VerbatimChar"/>
+              </w:rPr>
+              <w:t xml:space="preserve">max_iter = 500</w:t>
+            </w:r>
+            <w:r>
+              <w:t xml:space="preserve">. Panels C–D omit voronoiTreemap, whose layout runs in</w:t>
+            </w:r>
+            <w:r>
+              <w:t xml:space="preserve"> </w:t>
+            </w:r>
+            <w:r>
+              <w:t xml:space="preserve">the browser and is not measurable from R.</w:t>
             </w:r>
           </w:p>
           <w:bookmarkEnd w:id="39"/>
@@ -2512,7 +3296,49 @@
         <w:t xml:space="preserve"> </w:t>
       </w:r>
       <w:r>
-        <w:t xml:space="preserve">treemap, which summarises tens of categories, not thousands.</w:t>
+        <w:t xml:space="preserve">treemap, which summarises tens of categories, not thousands. Its main</w:t>
+      </w:r>
+      <w:r>
+        <w:t xml:space="preserve"> </w:t>
+      </w:r>
+      <w:r>
+        <w:t xml:space="preserve">current limitations are the quadratic per-iteration cost of the clipping</w:t>
+      </w:r>
+      <w:r>
+        <w:t xml:space="preserve"> </w:t>
+      </w:r>
+      <w:r>
+        <w:t xml:space="preserve">loop, which makes maps beyond a few hundred cells slow, and the absence of</w:t>
+      </w:r>
+      <w:r>
+        <w:t xml:space="preserve"> </w:t>
+      </w:r>
+      <w:r>
+        <w:t xml:space="preserve">leader lines for labelling cells too small to hold text. Both are planned:</w:t>
+      </w:r>
+      <w:r>
+        <w:t xml:space="preserve"> </w:t>
+      </w:r>
+      <w:r>
+        <w:t xml:space="preserve">spatial indexing restricts clipping to a cell’s actual neighbours and is</w:t>
+      </w:r>
+      <w:r>
+        <w:t xml:space="preserve"> </w:t>
+      </w:r>
+      <w:r>
+        <w:t xml:space="preserve">expected to reduce the large-map runtime by an order of magnitude without</w:t>
+      </w:r>
+      <w:r>
+        <w:t xml:space="preserve"> </w:t>
+      </w:r>
+      <w:r>
+        <w:t xml:space="preserve">leaving pure R, and callout labels are deferred until they can be added</w:t>
+      </w:r>
+      <w:r>
+        <w:t xml:space="preserve"> </w:t>
+      </w:r>
+      <w:r>
+        <w:t xml:space="preserve">without new hard dependencies.</w:t>
       </w:r>
     </w:p>
     <w:bookmarkEnd w:id="42"/>
@@ -2750,6 +3576,99 @@
       </w:r>
       <w:r>
         <w:t xml:space="preserve">and sites by farthest-point sampling, which removes degenerate starts.</w:t>
+      </w:r>
+      <w:r>
+        <w:t xml:space="preserve"> </w:t>
+      </w:r>
+      <w:r>
+        <w:t xml:space="preserve">Iteration stops when the maximum relative area error falls below</w:t>
+      </w:r>
+      <w:r>
+        <w:t xml:space="preserve"> </w:t>
+      </w:r>
+      <w:r>
+        <w:rPr>
+          <w:rStyle w:val="VerbatimChar"/>
+        </w:rPr>
+        <w:t xml:space="preserve">convergence_ratio</w:t>
+      </w:r>
+      <w:r>
+        <w:t xml:space="preserve"> </w:t>
+      </w:r>
+      <w:r>
+        <w:t xml:space="preserve">(default 1%) or after</w:t>
+      </w:r>
+      <w:r>
+        <w:t xml:space="preserve"> </w:t>
+      </w:r>
+      <w:r>
+        <w:rPr>
+          <w:rStyle w:val="VerbatimChar"/>
+        </w:rPr>
+        <w:t xml:space="preserve">max_iter</w:t>
+      </w:r>
+      <w:r>
+        <w:t xml:space="preserve"> </w:t>
+      </w:r>
+      <w:r>
+        <w:t xml:space="preserve">iterations (default</w:t>
+      </w:r>
+      <w:r>
+        <w:t xml:space="preserve"> </w:t>
+      </w:r>
+      <w:r>
+        <w:t xml:space="preserve">200); the returned object records both the iteration count and a</w:t>
+      </w:r>
+      <w:r>
+        <w:t xml:space="preserve"> </w:t>
+      </w:r>
+      <w:r>
+        <w:rPr>
+          <w:rStyle w:val="VerbatimChar"/>
+        </w:rPr>
+        <w:t xml:space="preserve">converged</w:t>
+      </w:r>
+      <w:r>
+        <w:t xml:space="preserve"> </w:t>
+      </w:r>
+      <w:r>
+        <w:t xml:space="preserve">flag, so an unconverged layout is never silent – rerunning</w:t>
+      </w:r>
+      <w:r>
+        <w:t xml:space="preserve"> </w:t>
+      </w:r>
+      <w:r>
+        <w:t xml:space="preserve">with a larger</w:t>
+      </w:r>
+      <w:r>
+        <w:t xml:space="preserve"> </w:t>
+      </w:r>
+      <w:r>
+        <w:rPr>
+          <w:rStyle w:val="VerbatimChar"/>
+        </w:rPr>
+        <w:t xml:space="preserve">max_iter</w:t>
+      </w:r>
+      <w:r>
+        <w:t xml:space="preserve"> </w:t>
+      </w:r>
+      <w:r>
+        <w:t xml:space="preserve">or a different</w:t>
+      </w:r>
+      <w:r>
+        <w:t xml:space="preserve"> </w:t>
+      </w:r>
+      <w:r>
+        <w:rPr>
+          <w:rStyle w:val="VerbatimChar"/>
+        </w:rPr>
+        <w:t xml:space="preserve">seed</w:t>
+      </w:r>
+      <w:r>
+        <w:t xml:space="preserve"> </w:t>
+      </w:r>
+      <w:r>
+        <w:t xml:space="preserve">resolves it.</w:t>
       </w:r>
     </w:p>
     <w:bookmarkEnd w:id="44"/>
@@ -2913,7 +3832,70 @@
         <w:t xml:space="preserve"> </w:t>
       </w:r>
       <w:r>
-        <w:t xml:space="preserve">convergence settings. Dependency counts are recursive Depends, Imports and</w:t>
+        <w:t xml:space="preserve">settings (for ggvmap:</w:t>
+      </w:r>
+      <w:r>
+        <w:t xml:space="preserve"> </w:t>
+      </w:r>
+      <w:r>
+        <w:rPr>
+          <w:rStyle w:val="VerbatimChar"/>
+        </w:rPr>
+        <w:t xml:space="preserve">convergence_ratio = 0.01</w:t>
+      </w:r>
+      <w:r>
+        <w:t xml:space="preserve">,</w:t>
+      </w:r>
+      <w:r>
+        <w:t xml:space="preserve"> </w:t>
+      </w:r>
+      <w:r>
+        <w:rPr>
+          <w:rStyle w:val="VerbatimChar"/>
+        </w:rPr>
+        <w:t xml:space="preserve">max_iter = 200</w:t>
+      </w:r>
+      <w:r>
+        <w:t xml:space="preserve">,</w:t>
+      </w:r>
+      <w:r>
+        <w:t xml:space="preserve"> </w:t>
+      </w:r>
+      <w:r>
+        <w:rPr>
+          <w:rStyle w:val="VerbatimChar"/>
+        </w:rPr>
+        <w:t xml:space="preserve">min_weight_ratio = 0.01</w:t>
+      </w:r>
+      <w:r>
+        <w:t xml:space="preserve">). Layouts that reach</w:t>
+      </w:r>
+      <w:r>
+        <w:t xml:space="preserve"> </w:t>
+      </w:r>
+      <w:r>
+        <w:rPr>
+          <w:rStyle w:val="VerbatimChar"/>
+        </w:rPr>
+        <w:t xml:space="preserve">max_iter</w:t>
+      </w:r>
+      <w:r>
+        <w:t xml:space="preserve"> </w:t>
+      </w:r>
+      <w:r>
+        <w:t xml:space="preserve">unconverged are</w:t>
+      </w:r>
+      <w:r>
+        <w:t xml:space="preserve"> </w:t>
+      </w:r>
+      <w:r>
+        <w:t xml:space="preserve">reported as measured; the text notes where a larger budget converges</w:t>
+      </w:r>
+      <w:r>
+        <w:t xml:space="preserve"> </w:t>
+      </w:r>
+      <w:r>
+        <w:t xml:space="preserve">them. Dependency counts are recursive Depends, Imports and</w:t>
       </w:r>
       <w:r>
         <w:t xml:space="preserve"> </w:t>

</xml_diff>